<commit_message>
feat(#321): Beteiligte: Support-Matrix mit Technik-Verknüpfung, Notfallkontakt & SLAs im Bericht
</commit_message>
<xml_diff>
--- a/exports/abnahme/analysebericht_anonymisiert.docx
+++ b/exports/abnahme/analysebericht_anonymisiert.docx
@@ -63,7 +63,7 @@
         <w:t>Datum:</w:t>
       </w:r>
       <w:r>
-        <w:t xml:space="preserve"> 12.08.2026</w:t>
+        <w:t xml:space="preserve"> 16.08.2026</w:t>
       </w:r>
     </w:p>
     <w:p>
@@ -128,7 +128,7 @@
         <w:t>Feldabdeckung:</w:t>
       </w:r>
       <w:r>
-        <w:t xml:space="preserve"> 100.0 % | </w:t>
+        <w:t xml:space="preserve"> 98.2 % | </w:t>
       </w:r>
       <w:r>
         <w:rPr>
@@ -457,7 +457,7 @@
         <w:pStyle w:val="Heading4"/>
       </w:pPr>
       <w:r>
-        <w:t>Gerät 2 (Firewall) (Firewall)</w:t>
+        <w:t>Objekt 2 (Firewall) (Firewall)</w:t>
       </w:r>
     </w:p>
     <w:p>
@@ -545,7 +545,7 @@
         <w:pStyle w:val="Heading4"/>
       </w:pPr>
       <w:r>
-        <w:t>Gerät 3 (Firewall) (Firewall)</w:t>
+        <w:t>Objekt 3 (Firewall) (Firewall)</w:t>
       </w:r>
     </w:p>
     <w:p>
@@ -618,7 +618,7 @@
         <w:pStyle w:val="Heading4"/>
       </w:pPr>
       <w:r>
-        <w:t>Gerät 6 (Serverraum) (Serverraum / IT-Raum)</w:t>
+        <w:t>Objekt 6 (Serverraum) (Serverraum / IT-Raum)</w:t>
       </w:r>
     </w:p>
     <w:p>
@@ -671,7 +671,7 @@
         <w:pStyle w:val="Heading4"/>
       </w:pPr>
       <w:r>
-        <w:t>Gerät 1 (Firewall) (Firewall)</w:t>
+        <w:t>Objekt 1 (Firewall) (Firewall)</w:t>
       </w:r>
     </w:p>
     <w:p>
@@ -819,7 +819,7 @@
         <w:pStyle w:val="Heading4"/>
       </w:pPr>
       <w:r>
-        <w:t>Gerät 4 (Usv) (USV (Unterbrechungsfreie Stromversorgung))</w:t>
+        <w:t>Objekt 4 (Usv) (USV (Unterbrechungsfreie Stromversorgung))</w:t>
       </w:r>
     </w:p>
     <w:p>
@@ -862,7 +862,7 @@
         <w:pStyle w:val="Heading4"/>
       </w:pPr>
       <w:r>
-        <w:t>Gerät 5 (Serverraum) (Serverraum / IT-Raum)</w:t>
+        <w:t>Objekt 5 (Serverraum) (Serverraum / IT-Raum)</w:t>
       </w:r>
     </w:p>
     <w:p>
@@ -940,7 +940,7 @@
         <w:pStyle w:val="Heading4"/>
       </w:pPr>
       <w:r>
-        <w:t>Gerät 7 (Netzwerkschrank) (Netzwerkschrank / Verteiler)</w:t>
+        <w:t>Objekt 7 (Netzwerkschrank) (Netzwerkschrank / Verteiler)</w:t>
       </w:r>
     </w:p>
     <w:p>
@@ -1038,7 +1038,7 @@
         <w:pStyle w:val="Heading4"/>
       </w:pPr>
       <w:r>
-        <w:t>Gerät 8 (Switch) (Switch / Aktive Netzwerktechnik)</w:t>
+        <w:t>Objekt 8 (Switch) (Switch / Aktive Netzwerktechnik)</w:t>
       </w:r>
     </w:p>
     <w:p>
@@ -1131,7 +1131,7 @@
         <w:pStyle w:val="Heading4"/>
       </w:pPr>
       <w:r>
-        <w:t>Gerät 9 (Access_point) (Access Point / WLAN-Infrastruktur)</w:t>
+        <w:t>Objekt 9 (Access_point) (Access Point / WLAN-Infrastruktur)</w:t>
       </w:r>
     </w:p>
     <w:p>
@@ -1324,7 +1324,7 @@
           </w:tcPr>
           <w:p>
             <w:r>
-              <w:t>Gerät 1 (Firewall)</w:t>
+              <w:t>Objekt 1 (Firewall)</w:t>
             </w:r>
           </w:p>
         </w:tc>
@@ -1376,7 +1376,7 @@
           </w:tcPr>
           <w:p>
             <w:r>
-              <w:t>Gerät 2 (Firewall)</w:t>
+              <w:t>Objekt 2 (Firewall)</w:t>
             </w:r>
           </w:p>
         </w:tc>
@@ -1428,7 +1428,7 @@
           </w:tcPr>
           <w:p>
             <w:r>
-              <w:t>Gerät 3 (Firewall)</w:t>
+              <w:t>Objekt 3 (Firewall)</w:t>
             </w:r>
           </w:p>
         </w:tc>
@@ -1480,7 +1480,7 @@
           </w:tcPr>
           <w:p>
             <w:r>
-              <w:t>Gerät 4 (Usv)</w:t>
+              <w:t>Objekt 4 (Usv)</w:t>
             </w:r>
           </w:p>
         </w:tc>
@@ -1532,7 +1532,7 @@
           </w:tcPr>
           <w:p>
             <w:r>
-              <w:t>Gerät 5 (Serverraum)</w:t>
+              <w:t>Objekt 5 (Serverraum)</w:t>
             </w:r>
           </w:p>
         </w:tc>
@@ -1584,7 +1584,7 @@
           </w:tcPr>
           <w:p>
             <w:r>
-              <w:t>Gerät 6 (Serverraum)</w:t>
+              <w:t>Objekt 6 (Serverraum)</w:t>
             </w:r>
           </w:p>
         </w:tc>
@@ -1636,7 +1636,7 @@
           </w:tcPr>
           <w:p>
             <w:r>
-              <w:t>Gerät 7 (Netzwerkschrank)</w:t>
+              <w:t>Objekt 7 (Netzwerkschrank)</w:t>
             </w:r>
           </w:p>
         </w:tc>
@@ -1688,7 +1688,7 @@
           </w:tcPr>
           <w:p>
             <w:r>
-              <w:t>Gerät 8 (Switch)</w:t>
+              <w:t>Objekt 8 (Switch)</w:t>
             </w:r>
           </w:p>
         </w:tc>
@@ -1728,7 +1728,7 @@
           </w:tcPr>
           <w:p>
             <w:r>
-              <w:t>vollständig</w:t>
+              <w:t>teilweise</w:t>
             </w:r>
           </w:p>
         </w:tc>
@@ -1740,7 +1740,7 @@
           </w:tcPr>
           <w:p>
             <w:r>
-              <w:t>Gerät 9 (Access_point)</w:t>
+              <w:t>Objekt 9 (Access_point)</w:t>
             </w:r>
           </w:p>
         </w:tc>
@@ -2341,7 +2341,7 @@
           </w:tcPr>
           <w:p>
             <w:r>
-              <w:t>Gerät 1 (Firewall)</w:t>
+              <w:t>Objekt 1 (Firewall)</w:t>
             </w:r>
           </w:p>
         </w:tc>
@@ -2413,7 +2413,7 @@
           </w:tcPr>
           <w:p>
             <w:r>
-              <w:t>Gerät 1 (Firewall)</w:t>
+              <w:t>Objekt 1 (Firewall)</w:t>
             </w:r>
           </w:p>
         </w:tc>
@@ -2485,7 +2485,7 @@
           </w:tcPr>
           <w:p>
             <w:r>
-              <w:t>Gerät 1 (Firewall)</w:t>
+              <w:t>Objekt 1 (Firewall)</w:t>
             </w:r>
           </w:p>
         </w:tc>
@@ -2557,7 +2557,7 @@
           </w:tcPr>
           <w:p>
             <w:r>
-              <w:t>Gerät 1 (Firewall)</w:t>
+              <w:t>Objekt 1 (Firewall)</w:t>
             </w:r>
           </w:p>
         </w:tc>
@@ -2629,7 +2629,7 @@
           </w:tcPr>
           <w:p>
             <w:r>
-              <w:t>Gerät 1 (Firewall)</w:t>
+              <w:t>Objekt 1 (Firewall)</w:t>
             </w:r>
           </w:p>
         </w:tc>
@@ -2701,7 +2701,7 @@
           </w:tcPr>
           <w:p>
             <w:r>
-              <w:t>Gerät 1 (Firewall)</w:t>
+              <w:t>Objekt 1 (Firewall)</w:t>
             </w:r>
           </w:p>
         </w:tc>
@@ -2773,7 +2773,7 @@
           </w:tcPr>
           <w:p>
             <w:r>
-              <w:t>Gerät 1 (Firewall)</w:t>
+              <w:t>Objekt 1 (Firewall)</w:t>
             </w:r>
           </w:p>
         </w:tc>
@@ -2845,7 +2845,7 @@
           </w:tcPr>
           <w:p>
             <w:r>
-              <w:t>Gerät 1 (Firewall)</w:t>
+              <w:t>Objekt 1 (Firewall)</w:t>
             </w:r>
           </w:p>
         </w:tc>
@@ -2917,7 +2917,7 @@
           </w:tcPr>
           <w:p>
             <w:r>
-              <w:t>Gerät 1 (Firewall)</w:t>
+              <w:t>Objekt 1 (Firewall)</w:t>
             </w:r>
           </w:p>
         </w:tc>
@@ -2989,7 +2989,7 @@
           </w:tcPr>
           <w:p>
             <w:r>
-              <w:t>Gerät 1 (Firewall)</w:t>
+              <w:t>Objekt 1 (Firewall)</w:t>
             </w:r>
           </w:p>
         </w:tc>
@@ -3061,7 +3061,7 @@
           </w:tcPr>
           <w:p>
             <w:r>
-              <w:t>Gerät 1 (Firewall)</w:t>
+              <w:t>Objekt 1 (Firewall)</w:t>
             </w:r>
           </w:p>
         </w:tc>
@@ -3133,7 +3133,7 @@
           </w:tcPr>
           <w:p>
             <w:r>
-              <w:t>Gerät 1 (Firewall)</w:t>
+              <w:t>Objekt 1 (Firewall)</w:t>
             </w:r>
           </w:p>
         </w:tc>
@@ -3205,7 +3205,7 @@
           </w:tcPr>
           <w:p>
             <w:r>
-              <w:t>Gerät 1 (Firewall)</w:t>
+              <w:t>Objekt 1 (Firewall)</w:t>
             </w:r>
           </w:p>
         </w:tc>
@@ -3277,7 +3277,7 @@
           </w:tcPr>
           <w:p>
             <w:r>
-              <w:t>Gerät 1 (Firewall)</w:t>
+              <w:t>Objekt 1 (Firewall)</w:t>
             </w:r>
           </w:p>
         </w:tc>
@@ -3349,7 +3349,7 @@
           </w:tcPr>
           <w:p>
             <w:r>
-              <w:t>Gerät 4 (Usv)</w:t>
+              <w:t>Objekt 4 (Usv)</w:t>
             </w:r>
           </w:p>
         </w:tc>
@@ -3421,7 +3421,7 @@
           </w:tcPr>
           <w:p>
             <w:r>
-              <w:t>Gerät 4 (Usv)</w:t>
+              <w:t>Objekt 4 (Usv)</w:t>
             </w:r>
           </w:p>
         </w:tc>
@@ -3493,7 +3493,7 @@
           </w:tcPr>
           <w:p>
             <w:r>
-              <w:t>Gerät 4 (Usv)</w:t>
+              <w:t>Objekt 4 (Usv)</w:t>
             </w:r>
           </w:p>
         </w:tc>
@@ -3565,7 +3565,7 @@
           </w:tcPr>
           <w:p>
             <w:r>
-              <w:t>Gerät 4 (Usv)</w:t>
+              <w:t>Objekt 4 (Usv)</w:t>
             </w:r>
           </w:p>
         </w:tc>
@@ -3637,7 +3637,7 @@
           </w:tcPr>
           <w:p>
             <w:r>
-              <w:t>Gerät 4 (Usv)</w:t>
+              <w:t>Objekt 4 (Usv)</w:t>
             </w:r>
           </w:p>
         </w:tc>
@@ -3709,7 +3709,7 @@
           </w:tcPr>
           <w:p>
             <w:r>
-              <w:t>Gerät 4 (Usv)</w:t>
+              <w:t>Objekt 4 (Usv)</w:t>
             </w:r>
           </w:p>
         </w:tc>
@@ -3781,7 +3781,7 @@
           </w:tcPr>
           <w:p>
             <w:r>
-              <w:t>Gerät 4 (Usv)</w:t>
+              <w:t>Objekt 4 (Usv)</w:t>
             </w:r>
           </w:p>
         </w:tc>
@@ -3853,7 +3853,7 @@
           </w:tcPr>
           <w:p>
             <w:r>
-              <w:t>Gerät 4 (Usv)</w:t>
+              <w:t>Objekt 4 (Usv)</w:t>
             </w:r>
           </w:p>
         </w:tc>
@@ -3925,7 +3925,7 @@
           </w:tcPr>
           <w:p>
             <w:r>
-              <w:t>Gerät 5 (Serverraum)</w:t>
+              <w:t>Objekt 5 (Serverraum)</w:t>
             </w:r>
           </w:p>
         </w:tc>
@@ -3997,7 +3997,7 @@
           </w:tcPr>
           <w:p>
             <w:r>
-              <w:t>Gerät 5 (Serverraum)</w:t>
+              <w:t>Objekt 5 (Serverraum)</w:t>
             </w:r>
           </w:p>
         </w:tc>
@@ -4069,7 +4069,7 @@
           </w:tcPr>
           <w:p>
             <w:r>
-              <w:t>Gerät 5 (Serverraum)</w:t>
+              <w:t>Objekt 5 (Serverraum)</w:t>
             </w:r>
           </w:p>
         </w:tc>
@@ -4141,7 +4141,7 @@
           </w:tcPr>
           <w:p>
             <w:r>
-              <w:t>Gerät 5 (Serverraum)</w:t>
+              <w:t>Objekt 5 (Serverraum)</w:t>
             </w:r>
           </w:p>
         </w:tc>
@@ -4213,7 +4213,7 @@
           </w:tcPr>
           <w:p>
             <w:r>
-              <w:t>Gerät 5 (Serverraum)</w:t>
+              <w:t>Objekt 5 (Serverraum)</w:t>
             </w:r>
           </w:p>
         </w:tc>
@@ -4285,7 +4285,7 @@
           </w:tcPr>
           <w:p>
             <w:r>
-              <w:t>Gerät 5 (Serverraum)</w:t>
+              <w:t>Objekt 5 (Serverraum)</w:t>
             </w:r>
           </w:p>
         </w:tc>
@@ -4357,7 +4357,7 @@
           </w:tcPr>
           <w:p>
             <w:r>
-              <w:t>Gerät 5 (Serverraum)</w:t>
+              <w:t>Objekt 5 (Serverraum)</w:t>
             </w:r>
           </w:p>
         </w:tc>
@@ -4429,7 +4429,7 @@
           </w:tcPr>
           <w:p>
             <w:r>
-              <w:t>Gerät 5 (Serverraum)</w:t>
+              <w:t>Objekt 5 (Serverraum)</w:t>
             </w:r>
           </w:p>
         </w:tc>
@@ -4501,7 +4501,7 @@
           </w:tcPr>
           <w:p>
             <w:r>
-              <w:t>Gerät 6 (Serverraum)</w:t>
+              <w:t>Objekt 6 (Serverraum)</w:t>
             </w:r>
           </w:p>
         </w:tc>
@@ -4573,7 +4573,7 @@
           </w:tcPr>
           <w:p>
             <w:r>
-              <w:t>Gerät 6 (Serverraum)</w:t>
+              <w:t>Objekt 6 (Serverraum)</w:t>
             </w:r>
           </w:p>
         </w:tc>
@@ -4645,7 +4645,7 @@
           </w:tcPr>
           <w:p>
             <w:r>
-              <w:t>Gerät 6 (Serverraum)</w:t>
+              <w:t>Objekt 6 (Serverraum)</w:t>
             </w:r>
           </w:p>
         </w:tc>
@@ -4717,7 +4717,7 @@
           </w:tcPr>
           <w:p>
             <w:r>
-              <w:t>Gerät 7 (Netzwerkschrank)</w:t>
+              <w:t>Objekt 7 (Netzwerkschrank)</w:t>
             </w:r>
           </w:p>
         </w:tc>
@@ -4789,7 +4789,7 @@
           </w:tcPr>
           <w:p>
             <w:r>
-              <w:t>Gerät 7 (Netzwerkschrank)</w:t>
+              <w:t>Objekt 7 (Netzwerkschrank)</w:t>
             </w:r>
           </w:p>
         </w:tc>
@@ -4861,7 +4861,7 @@
           </w:tcPr>
           <w:p>
             <w:r>
-              <w:t>Gerät 7 (Netzwerkschrank)</w:t>
+              <w:t>Objekt 7 (Netzwerkschrank)</w:t>
             </w:r>
           </w:p>
         </w:tc>
@@ -4933,7 +4933,7 @@
           </w:tcPr>
           <w:p>
             <w:r>
-              <w:t>Gerät 7 (Netzwerkschrank)</w:t>
+              <w:t>Objekt 7 (Netzwerkschrank)</w:t>
             </w:r>
           </w:p>
         </w:tc>
@@ -5005,7 +5005,7 @@
           </w:tcPr>
           <w:p>
             <w:r>
-              <w:t>Gerät 7 (Netzwerkschrank)</w:t>
+              <w:t>Objekt 7 (Netzwerkschrank)</w:t>
             </w:r>
           </w:p>
         </w:tc>
@@ -5077,7 +5077,7 @@
           </w:tcPr>
           <w:p>
             <w:r>
-              <w:t>Gerät 7 (Netzwerkschrank)</w:t>
+              <w:t>Objekt 7 (Netzwerkschrank)</w:t>
             </w:r>
           </w:p>
         </w:tc>
@@ -5149,7 +5149,7 @@
           </w:tcPr>
           <w:p>
             <w:r>
-              <w:t>Gerät 7 (Netzwerkschrank)</w:t>
+              <w:t>Objekt 7 (Netzwerkschrank)</w:t>
             </w:r>
           </w:p>
         </w:tc>
@@ -5221,7 +5221,7 @@
           </w:tcPr>
           <w:p>
             <w:r>
-              <w:t>Gerät 7 (Netzwerkschrank)</w:t>
+              <w:t>Objekt 7 (Netzwerkschrank)</w:t>
             </w:r>
           </w:p>
         </w:tc>
@@ -5293,7 +5293,7 @@
           </w:tcPr>
           <w:p>
             <w:r>
-              <w:t>Gerät 7 (Netzwerkschrank)</w:t>
+              <w:t>Objekt 7 (Netzwerkschrank)</w:t>
             </w:r>
           </w:p>
         </w:tc>
@@ -5365,7 +5365,7 @@
           </w:tcPr>
           <w:p>
             <w:r>
-              <w:t>Gerät 8 (Switch)</w:t>
+              <w:t>Objekt 8 (Switch)</w:t>
             </w:r>
           </w:p>
         </w:tc>
@@ -5437,7 +5437,7 @@
           </w:tcPr>
           <w:p>
             <w:r>
-              <w:t>Gerät 8 (Switch)</w:t>
+              <w:t>Objekt 8 (Switch)</w:t>
             </w:r>
           </w:p>
         </w:tc>
@@ -5509,7 +5509,7 @@
           </w:tcPr>
           <w:p>
             <w:r>
-              <w:t>Gerät 8 (Switch)</w:t>
+              <w:t>Objekt 8 (Switch)</w:t>
             </w:r>
           </w:p>
         </w:tc>
@@ -5581,7 +5581,7 @@
           </w:tcPr>
           <w:p>
             <w:r>
-              <w:t>Gerät 8 (Switch)</w:t>
+              <w:t>Objekt 8 (Switch)</w:t>
             </w:r>
           </w:p>
         </w:tc>
@@ -5653,7 +5653,7 @@
           </w:tcPr>
           <w:p>
             <w:r>
-              <w:t>Gerät 8 (Switch)</w:t>
+              <w:t>Objekt 8 (Switch)</w:t>
             </w:r>
           </w:p>
         </w:tc>
@@ -5725,7 +5725,7 @@
           </w:tcPr>
           <w:p>
             <w:r>
-              <w:t>Gerät 8 (Switch)</w:t>
+              <w:t>Objekt 8 (Switch)</w:t>
             </w:r>
           </w:p>
         </w:tc>
@@ -5797,7 +5797,7 @@
           </w:tcPr>
           <w:p>
             <w:r>
-              <w:t>Gerät 8 (Switch)</w:t>
+              <w:t>Objekt 8 (Switch)</w:t>
             </w:r>
           </w:p>
         </w:tc>
@@ -5869,7 +5869,7 @@
           </w:tcPr>
           <w:p>
             <w:r>
-              <w:t>Gerät 8 (Switch)</w:t>
+              <w:t>Objekt 8 (Switch)</w:t>
             </w:r>
           </w:p>
         </w:tc>
@@ -5941,7 +5941,7 @@
           </w:tcPr>
           <w:p>
             <w:r>
-              <w:t>Gerät 8 (Switch)</w:t>
+              <w:t>Objekt 8 (Switch)</w:t>
             </w:r>
           </w:p>
         </w:tc>
@@ -6013,7 +6013,7 @@
           </w:tcPr>
           <w:p>
             <w:r>
-              <w:t>Gerät 9 (Access_point)</w:t>
+              <w:t>Objekt 9 (Access_point)</w:t>
             </w:r>
           </w:p>
         </w:tc>
@@ -6085,7 +6085,7 @@
           </w:tcPr>
           <w:p>
             <w:r>
-              <w:t>Gerät 9 (Access_point)</w:t>
+              <w:t>Objekt 9 (Access_point)</w:t>
             </w:r>
           </w:p>
         </w:tc>
@@ -6157,7 +6157,7 @@
           </w:tcPr>
           <w:p>
             <w:r>
-              <w:t>Gerät 9 (Access_point)</w:t>
+              <w:t>Objekt 9 (Access_point)</w:t>
             </w:r>
           </w:p>
         </w:tc>
@@ -6229,7 +6229,7 @@
           </w:tcPr>
           <w:p>
             <w:r>
-              <w:t>Gerät 9 (Access_point)</w:t>
+              <w:t>Objekt 9 (Access_point)</w:t>
             </w:r>
           </w:p>
         </w:tc>
@@ -6301,7 +6301,7 @@
           </w:tcPr>
           <w:p>
             <w:r>
-              <w:t>Gerät 9 (Access_point)</w:t>
+              <w:t>Objekt 9 (Access_point)</w:t>
             </w:r>
           </w:p>
         </w:tc>
@@ -6373,7 +6373,7 @@
           </w:tcPr>
           <w:p>
             <w:r>
-              <w:t>Gerät 9 (Access_point)</w:t>
+              <w:t>Objekt 9 (Access_point)</w:t>
             </w:r>
           </w:p>
         </w:tc>
@@ -6445,7 +6445,7 @@
           </w:tcPr>
           <w:p>
             <w:r>
-              <w:t>Gerät 9 (Access_point)</w:t>
+              <w:t>Objekt 9 (Access_point)</w:t>
             </w:r>
           </w:p>
         </w:tc>

</xml_diff>

<commit_message>
feat(#323): Trennung Storage vs. Backup & Neuer Baustein Organisation & Prozesse
</commit_message>
<xml_diff>
--- a/exports/abnahme/analysebericht_anonymisiert.docx
+++ b/exports/abnahme/analysebericht_anonymisiert.docx
@@ -104,7 +104,20 @@
         <w:pStyle w:val="Heading2"/>
       </w:pPr>
       <w:r>
-        <w:t>2. Executive Summary &amp; Bewertung der IT-Umgebung</w:t>
+        <w:t>2. Ansprechpartner &amp; Support-Matrix</w:t>
+      </w:r>
+    </w:p>
+    <w:p>
+      <w:r>
+        <w:t>Es wurden keine Ansprechpartner oder Support-Kontakte erfasst.</w:t>
+      </w:r>
+    </w:p>
+    <w:p>
+      <w:pPr>
+        <w:pStyle w:val="Heading2"/>
+      </w:pPr>
+      <w:r>
+        <w:t>3. Executive Summary &amp; Bewertung der IT-Umgebung</w:t>
       </w:r>
     </w:p>
     <w:p>
@@ -429,7 +442,7 @@
         <w:pStyle w:val="Heading2"/>
       </w:pPr>
       <w:r>
-        <w:t>3. Technische Infrastruktur und Fachkapitel</w:t>
+        <w:t>4. Technische Infrastruktur und Fachkapitel</w:t>
       </w:r>
     </w:p>
     <w:p>
@@ -1234,7 +1247,7 @@
         <w:pStyle w:val="Heading2"/>
       </w:pPr>
       <w:r>
-        <w:t>4. Übersichtstabellen Erfasster Systeme</w:t>
+        <w:t>5. Übersichtstabellen Erfasster Systeme</w:t>
       </w:r>
     </w:p>
     <w:tbl>
@@ -1791,7 +1804,7 @@
         <w:pStyle w:val="Heading2"/>
       </w:pPr>
       <w:r>
-        <w:t>5. Feststellungen (Findings)</w:t>
+        <w:t>6. Feststellungen (Findings)</w:t>
       </w:r>
     </w:p>
     <w:tbl>
@@ -6516,7 +6529,7 @@
         <w:pStyle w:val="Heading2"/>
       </w:pPr>
       <w:r>
-        <w:t>6. Priorisierter Maßnahmenkatalog</w:t>
+        <w:t>7. Priorisierter Maßnahmenkatalog</w:t>
       </w:r>
     </w:p>
     <w:p>

</xml_diff>